<commit_message>
docs: point guide to live demonstration
</commit_message>
<xml_diff>
--- a/docs/IMAGE_TRACE_Project_Guide.docx
+++ b/docs/IMAGE_TRACE_Project_Guide.docx
@@ -353,7 +353,7 @@
                 <w:color w:val="000000"/>
                 <w:sz w:val="18"/>
               </w:rPr>
-              <w:t>image-trace-demo.polite-tulip-8246.chatgpt.site</w:t>
+              <w:t>image-trace-demo.eshaansarkhawas007.chatgpt.site</w:t>
             </w:r>
           </w:p>
         </w:tc>
@@ -8847,7 +8847,7 @@
           <w:rFonts w:ascii="Helvetica Neue" w:hAnsi="Helvetica Neue"/>
           <w:sz w:val="21"/>
         </w:rPr>
-        <w:t>The complete MVP exists as a committed local Git repository and runs through the documented PowerShell or Unix-like commands. The public website demonstrates the interface and methodology without accepting evidence. The source repository URL is https://github.com/EshaanS013/image-trace.</w:t>
+        <w:t>The complete MVP exists as a committed local Git repository and runs through the documented PowerShell or Unix-like commands. The public website demonstrates the interface and methodology without accepting evidence. The live demonstration is https://image-trace-demo.eshaansarkhawas007.chatgpt.site and the source repository URL is https://github.com/EshaanS013/image-trace.</w:t>
       </w:r>
     </w:p>
     <w:p>

</xml_diff>